<commit_message>
feat: remove Prioridade e Entrega Ponderada da exportacao CSV de iniciativas
Mesmos campos ja retirados do formulario (legados, baixa adesao). Os dados
historicos continuam no banco, so nao saem mais na planilha exportada.

Co-Authored-By: Claude Opus 4.8 <noreply@anthropic.com>
</commit_message>
<xml_diff>
--- a/Documentacao-Backup-Portfolio-GHT.docx
+++ b/Documentacao-Backup-Portfolio-GHT.docx
@@ -479,7 +479,7 @@
                 <w:sz w:val="20"/>
                 <w:szCs w:val="20"/>
               </w:rPr>
-              <w:t xml:space="preserve">08 de setembro de 2026</w:t>
+              <w:t xml:space="preserve">09 de setembro de 2026</w:t>
             </w:r>
           </w:p>
         </w:tc>
@@ -4644,6 +4644,174 @@
           <w:szCs w:val="22"/>
         </w:rPr>
         <w:t xml:space="preserve"> a chave JSON atual está guardada somente no painel do Render (Environment), marcada como segredo — ela NÃO está no repositório do GitHub por segurança. Se for perdida, gere uma nova chave para a mesma conta de serviço (passo 5 acima) e cole no Render.</w:t>
+      </w:r>
+    </w:p>
+    <w:p>
+      <w:pPr>
+        <w:pStyle w:val="Heading2"/>
+        <w:spacing w:after="140" w:before="300"/>
+      </w:pPr>
+      <w:r>
+        <w:t xml:space="preserve">5.3 Por que existe um "banco local" (SQLite) se já temos o BigQuery</w:t>
+      </w:r>
+    </w:p>
+    <w:p>
+      <w:pPr>
+        <w:spacing w:after="160" w:line="300"/>
+      </w:pPr>
+      <w:r>
+        <w:rPr>
+          <w:rFonts w:ascii="Calibri" w:cs="Calibri" w:eastAsia="Calibri" w:hAnsi="Calibri"/>
+          <w:color w:val="1E293B"/>
+          <w:sz w:val="22"/>
+          <w:szCs w:val="22"/>
+        </w:rPr>
+        <w:t xml:space="preserve">O código tem duas formas de gravar dados: BigQuery (produção, na nuvem) e SQLite (arquivo local, automático). A escolha não é manual — o próprio backend decide sozinho, no arquivo repository.js:</w:t>
+      </w:r>
+    </w:p>
+    <w:p>
+      <w:pPr>
+        <w:shd w:fill="0F172A" w:val="clear"/>
+        <w:spacing w:after="200" w:before="80" w:line="260"/>
+      </w:pPr>
+      <w:r>
+        <w:rPr>
+          <w:rFonts w:ascii="Consolas" w:cs="Consolas" w:eastAsia="Consolas" w:hAnsi="Consolas"/>
+          <w:color w:val="E2E8F0"/>
+          <w:sz w:val="18"/>
+          <w:szCs w:val="18"/>
+        </w:rPr>
+        <w:t xml:space="preserve">se existir a credencial do Google Cloud configurada:</w:t>
+      </w:r>
+      <w:r>
+        <w:rPr>
+          <w:rFonts w:ascii="Consolas" w:cs="Consolas" w:eastAsia="Consolas" w:hAnsi="Consolas"/>
+          <w:color w:val="E2E8F0"/>
+          <w:sz w:val="18"/>
+          <w:szCs w:val="18"/>
+        </w:rPr>
+        <w:br/>
+        <w:t xml:space="preserve">    usa o BigQuery</w:t>
+      </w:r>
+      <w:r>
+        <w:rPr>
+          <w:rFonts w:ascii="Consolas" w:cs="Consolas" w:eastAsia="Consolas" w:hAnsi="Consolas"/>
+          <w:color w:val="E2E8F0"/>
+          <w:sz w:val="18"/>
+          <w:szCs w:val="18"/>
+        </w:rPr>
+        <w:br/>
+        <w:t xml:space="preserve">senao:</w:t>
+      </w:r>
+      <w:r>
+        <w:rPr>
+          <w:rFonts w:ascii="Consolas" w:cs="Consolas" w:eastAsia="Consolas" w:hAnsi="Consolas"/>
+          <w:color w:val="E2E8F0"/>
+          <w:sz w:val="18"/>
+          <w:szCs w:val="18"/>
+        </w:rPr>
+        <w:br/>
+        <w:t xml:space="preserve">    usa o SQLite (um arquivo local, criado na hora, sem nenhuma configuracao)</w:t>
+      </w:r>
+    </w:p>
+    <w:p>
+      <w:pPr>
+        <w:spacing w:after="160" w:line="300"/>
+      </w:pPr>
+      <w:r>
+        <w:rPr>
+          <w:rFonts w:ascii="Calibri" w:cs="Calibri" w:eastAsia="Calibri" w:hAnsi="Calibri"/>
+          <w:color w:val="1E293B"/>
+          <w:sz w:val="22"/>
+          <w:szCs w:val="22"/>
+        </w:rPr>
+        <w:t xml:space="preserve">O SQLite não é uma alternativa de produção — é um recurso para desenvolvimento local. Serve para três coisas:</w:t>
+      </w:r>
+    </w:p>
+    <w:p>
+      <w:pPr>
+        <w:pStyle w:val="ListParagraph"/>
+        <w:numPr>
+          <w:ilvl w:val="0"/>
+          <w:numId w:val="3"/>
+        </w:numPr>
+        <w:spacing w:after="90" w:line="290"/>
+      </w:pPr>
+      <w:r>
+        <w:rPr>
+          <w:rFonts w:ascii="Calibri" w:cs="Calibri" w:eastAsia="Calibri" w:hAnsi="Calibri"/>
+          <w:color w:val="1E293B"/>
+          <w:sz w:val="22"/>
+          <w:szCs w:val="22"/>
+        </w:rPr>
+        <w:t xml:space="preserve">Rodar o projeto em qualquer computador sem precisar primeiro conseguir credenciais do Google Cloud — quem for testar uma mudança de tela consegue abrir a aplicação na hora.</w:t>
+      </w:r>
+    </w:p>
+    <w:p>
+      <w:pPr>
+        <w:pStyle w:val="ListParagraph"/>
+        <w:numPr>
+          <w:ilvl w:val="0"/>
+          <w:numId w:val="3"/>
+        </w:numPr>
+        <w:spacing w:after="90" w:line="290"/>
+      </w:pPr>
+      <w:r>
+        <w:rPr>
+          <w:rFonts w:ascii="Calibri" w:cs="Calibri" w:eastAsia="Calibri" w:hAnsi="Calibri"/>
+          <w:color w:val="1E293B"/>
+          <w:sz w:val="22"/>
+          <w:szCs w:val="22"/>
+        </w:rPr>
+        <w:t xml:space="preserve">Testar mudanças sem nenhum risco de afetar os dados reais de produção (nem custo de consulta no Google Cloud).</w:t>
+      </w:r>
+    </w:p>
+    <w:p>
+      <w:pPr>
+        <w:pStyle w:val="ListParagraph"/>
+        <w:numPr>
+          <w:ilvl w:val="0"/>
+          <w:numId w:val="3"/>
+        </w:numPr>
+        <w:spacing w:after="90" w:line="290"/>
+      </w:pPr>
+      <w:r>
+        <w:rPr>
+          <w:rFonts w:ascii="Calibri" w:cs="Calibri" w:eastAsia="Calibri" w:hAnsi="Calibri"/>
+          <w:color w:val="1E293B"/>
+          <w:sz w:val="22"/>
+          <w:szCs w:val="22"/>
+        </w:rPr>
+        <w:t xml:space="preserve">É um resquício de uma versão anterior do sistema, que usava PostgreSQL do próprio Render antes de migrar para o BigQuery — o caminho antigo nunca foi removido porque continua útil para desenvolvimento.</w:t>
+      </w:r>
+    </w:p>
+    <w:p>
+      <w:pPr>
+        <w:pBdr>
+          <w:left w:val="single" w:color="D97706" w:sz="28"/>
+        </w:pBdr>
+        <w:shd w:fill="FEF3C7" w:val="clear"/>
+        <w:spacing w:after="220" w:before="120" w:line="300"/>
+      </w:pPr>
+      <w:r>
+        <w:rPr>
+          <w:rFonts w:ascii="Calibri" w:cs="Calibri" w:eastAsia="Calibri" w:hAnsi="Calibri"/>
+          <w:b/>
+          <w:bCs/>
+          <w:color w:val="B45309"/>
+          <w:sz w:val="22"/>
+          <w:szCs w:val="22"/>
+        </w:rPr>
+        <w:t xml:space="preserve">⚠ Risco a que ficar atento — o fallback é silencioso:  </w:t>
+      </w:r>
+      <w:r>
+        <w:rPr>
+          <w:rFonts w:ascii="Calibri" w:cs="Calibri" w:eastAsia="Calibri" w:hAnsi="Calibri"/>
+          <w:color w:val="78350F"/>
+          <w:sz w:val="22"/>
+          <w:szCs w:val="22"/>
+        </w:rPr>
+        <w:t xml:space="preserve"> se a variável GOOGLE_APPLICATION_CREDENTIALS_JSON sumir, expirar ou for digitada errado no Render (produção), o aplicativo NÃO trava com erro visível. Ele simplesmente passa a usar um SQLite vazio, criado do zero, sem nenhum aviso claro de que trocou de banco. Nesse cenário, alguém abriria o site e veria "0 iniciativas" — parecendo que os dados sumiram, quando na verdade a aplicação só desviou para um banco local vazio. Se isso acontecer: confira primeiro a variável GOOGLE_APPLICATION_CREDENTIALS_JSON no painel do Render antes de supor perda de dados — os dados reais continuam intactos no BigQuery.</w:t>
       </w:r>
     </w:p>
     <w:p>

</xml_diff>